<commit_message>
Updated with review edits and DOCX output.
</commit_message>
<xml_diff>
--- a/docx/Parts/Part1.docx
+++ b/docx/Parts/Part1.docx
@@ -949,7 +949,7 @@
         <w:rPr>
           <w:color w:val="0000FF"/>
         </w:rPr>
-        <w:instrText xml:space="preserve"> REF _Numd19e6659 \h </w:instrText>
+        <w:instrText xml:space="preserve"> REF _Numd19e6671 \h </w:instrText>
       </w:r>
       <w:r>
         <w:fldChar w:fldCharType="separate"/>
@@ -995,7 +995,7 @@
         <w:rPr>
           <w:color w:val="0000FF"/>
         </w:rPr>
-        <w:instrText xml:space="preserve"> REF _Numd19e7025 \h </w:instrText>
+        <w:instrText xml:space="preserve"> REF _Numd19e7037 \h </w:instrText>
       </w:r>
       <w:r>
         <w:fldChar w:fldCharType="separate"/>
@@ -1041,7 +1041,7 @@
         <w:rPr>
           <w:color w:val="0000FF"/>
         </w:rPr>
-        <w:instrText xml:space="preserve"> REF _Numd19e7038 \h </w:instrText>
+        <w:instrText xml:space="preserve"> REF _Numd19e7050 \h </w:instrText>
       </w:r>
       <w:r>
         <w:fldChar w:fldCharType="separate"/>
@@ -1087,7 +1087,7 @@
         <w:rPr>
           <w:color w:val="0000FF"/>
         </w:rPr>
-        <w:instrText xml:space="preserve"> REF _Numd19e7051 \h </w:instrText>
+        <w:instrText xml:space="preserve"> REF _Numd19e7063 \h </w:instrText>
       </w:r>
       <w:r>
         <w:fldChar w:fldCharType="separate"/>
@@ -1133,7 +1133,7 @@
         <w:rPr>
           <w:color w:val="0000FF"/>
         </w:rPr>
-        <w:instrText xml:space="preserve"> REF _Numd19e7207 \h </w:instrText>
+        <w:instrText xml:space="preserve"> REF _Numd19e7219 \h </w:instrText>
       </w:r>
       <w:r>
         <w:fldChar w:fldCharType="separate"/>
@@ -1179,7 +1179,7 @@
         <w:rPr>
           <w:color w:val="0000FF"/>
         </w:rPr>
-        <w:instrText xml:space="preserve"> REF _Numd19e7274 \h </w:instrText>
+        <w:instrText xml:space="preserve"> REF _Numd19e7286 \h </w:instrText>
       </w:r>
       <w:r>
         <w:fldChar w:fldCharType="separate"/>
@@ -1225,7 +1225,7 @@
         <w:rPr>
           <w:color w:val="0000FF"/>
         </w:rPr>
-        <w:instrText xml:space="preserve"> REF _Numd19e7298 \h </w:instrText>
+        <w:instrText xml:space="preserve"> REF _Numd19e7310 \h </w:instrText>
       </w:r>
       <w:r>
         <w:fldChar w:fldCharType="separate"/>
@@ -1271,7 +1271,7 @@
         <w:rPr>
           <w:color w:val="0000FF"/>
         </w:rPr>
-        <w:instrText xml:space="preserve"> REF _Numd19e7311 \h </w:instrText>
+        <w:instrText xml:space="preserve"> REF _Numd19e7323 \h </w:instrText>
       </w:r>
       <w:r>
         <w:fldChar w:fldCharType="separate"/>
@@ -1317,7 +1317,7 @@
         <w:rPr>
           <w:color w:val="0000FF"/>
         </w:rPr>
-        <w:instrText xml:space="preserve"> REF _Numd19e7430 \h </w:instrText>
+        <w:instrText xml:space="preserve"> REF _Numd19e7442 \h </w:instrText>
       </w:r>
       <w:r>
         <w:fldChar w:fldCharType="separate"/>
@@ -1363,7 +1363,7 @@
         <w:rPr>
           <w:color w:val="0000FF"/>
         </w:rPr>
-        <w:instrText xml:space="preserve"> REF _Numd19e7464 \h </w:instrText>
+        <w:instrText xml:space="preserve"> REF _Numd19e7476 \h </w:instrText>
       </w:r>
       <w:r>
         <w:fldChar w:fldCharType="separate"/>
@@ -1409,7 +1409,7 @@
         <w:rPr>
           <w:color w:val="0000FF"/>
         </w:rPr>
-        <w:instrText xml:space="preserve"> REF _Numd19e7517 \h </w:instrText>
+        <w:instrText xml:space="preserve"> REF _Numd19e7529 \h </w:instrText>
       </w:r>
       <w:r>
         <w:fldChar w:fldCharType="separate"/>
@@ -1455,7 +1455,7 @@
         <w:rPr>
           <w:color w:val="0000FF"/>
         </w:rPr>
-        <w:instrText xml:space="preserve"> REF _Numd19e7585 \h </w:instrText>
+        <w:instrText xml:space="preserve"> REF _Numd19e7597 \h </w:instrText>
       </w:r>
       <w:r>
         <w:fldChar w:fldCharType="separate"/>
@@ -1501,7 +1501,7 @@
         <w:rPr>
           <w:color w:val="0000FF"/>
         </w:rPr>
-        <w:instrText xml:space="preserve"> REF _Numd19e7598 \h </w:instrText>
+        <w:instrText xml:space="preserve"> REF _Numd19e7610 \h </w:instrText>
       </w:r>
       <w:r>
         <w:fldChar w:fldCharType="separate"/>
@@ -1547,7 +1547,7 @@
         <w:rPr>
           <w:color w:val="0000FF"/>
         </w:rPr>
-        <w:instrText xml:space="preserve"> REF _Numd19e7621 \h </w:instrText>
+        <w:instrText xml:space="preserve"> REF _Numd19e7633 \h </w:instrText>
       </w:r>
       <w:r>
         <w:fldChar w:fldCharType="separate"/>
@@ -1593,7 +1593,7 @@
         <w:rPr>
           <w:color w:val="0000FF"/>
         </w:rPr>
-        <w:instrText xml:space="preserve"> REF _Numd19e7715 \h </w:instrText>
+        <w:instrText xml:space="preserve"> REF _Numd19e7727 \h </w:instrText>
       </w:r>
       <w:r>
         <w:fldChar w:fldCharType="separate"/>
@@ -1639,7 +1639,7 @@
         <w:rPr>
           <w:color w:val="0000FF"/>
         </w:rPr>
-        <w:instrText xml:space="preserve"> REF _Numd19e7759 \h </w:instrText>
+        <w:instrText xml:space="preserve"> REF _Numd19e7771 \h </w:instrText>
       </w:r>
       <w:r>
         <w:fldChar w:fldCharType="separate"/>
@@ -1685,7 +1685,7 @@
         <w:rPr>
           <w:color w:val="0000FF"/>
         </w:rPr>
-        <w:instrText xml:space="preserve"> REF _Numd19e7781 \h </w:instrText>
+        <w:instrText xml:space="preserve"> REF _Numd19e7793 \h </w:instrText>
       </w:r>
       <w:r>
         <w:fldChar w:fldCharType="separate"/>
@@ -1731,7 +1731,7 @@
         <w:rPr>
           <w:color w:val="0000FF"/>
         </w:rPr>
-        <w:instrText xml:space="preserve"> REF _Numd19e7843 \h </w:instrText>
+        <w:instrText xml:space="preserve"> REF _Numd19e7855 \h </w:instrText>
       </w:r>
       <w:r>
         <w:fldChar w:fldCharType="separate"/>
@@ -1777,7 +1777,7 @@
         <w:rPr>
           <w:color w:val="0000FF"/>
         </w:rPr>
-        <w:instrText xml:space="preserve"> REF _Numd19e7898 \h </w:instrText>
+        <w:instrText xml:space="preserve"> REF _Numd19e7910 \h </w:instrText>
       </w:r>
       <w:r>
         <w:fldChar w:fldCharType="separate"/>
@@ -1823,7 +1823,7 @@
         <w:rPr>
           <w:color w:val="0000FF"/>
         </w:rPr>
-        <w:instrText xml:space="preserve"> REF _Numd19e7911 \h </w:instrText>
+        <w:instrText xml:space="preserve"> REF _Numd19e7923 \h </w:instrText>
       </w:r>
       <w:r>
         <w:fldChar w:fldCharType="separate"/>
@@ -1869,7 +1869,7 @@
         <w:rPr>
           <w:color w:val="0000FF"/>
         </w:rPr>
-        <w:instrText xml:space="preserve"> REF _Numd19e7924 \h </w:instrText>
+        <w:instrText xml:space="preserve"> REF _Numd19e7936 \h </w:instrText>
       </w:r>
       <w:r>
         <w:fldChar w:fldCharType="separate"/>
@@ -1915,7 +1915,7 @@
         <w:rPr>
           <w:color w:val="0000FF"/>
         </w:rPr>
-        <w:instrText xml:space="preserve"> REF _Numd19e7946 \h </w:instrText>
+        <w:instrText xml:space="preserve"> REF _Numd19e7958 \h </w:instrText>
       </w:r>
       <w:r>
         <w:fldChar w:fldCharType="separate"/>
@@ -1961,7 +1961,7 @@
         <w:rPr>
           <w:color w:val="0000FF"/>
         </w:rPr>
-        <w:instrText xml:space="preserve"> REF _Numd19e8015 \h </w:instrText>
+        <w:instrText xml:space="preserve"> REF _Numd19e8027 \h </w:instrText>
       </w:r>
       <w:r>
         <w:fldChar w:fldCharType="separate"/>
@@ -2007,7 +2007,7 @@
         <w:rPr>
           <w:color w:val="0000FF"/>
         </w:rPr>
-        <w:instrText xml:space="preserve"> REF _Numd19e8049 \h </w:instrText>
+        <w:instrText xml:space="preserve"> REF _Numd19e8061 \h </w:instrText>
       </w:r>
       <w:r>
         <w:fldChar w:fldCharType="separate"/>
@@ -2053,7 +2053,7 @@
         <w:rPr>
           <w:color w:val="0000FF"/>
         </w:rPr>
-        <w:instrText xml:space="preserve"> REF _Numd19e8067 \h </w:instrText>
+        <w:instrText xml:space="preserve"> REF _Numd19e8079 \h </w:instrText>
       </w:r>
       <w:r>
         <w:fldChar w:fldCharType="separate"/>
@@ -2099,7 +2099,7 @@
         <w:rPr>
           <w:color w:val="0000FF"/>
         </w:rPr>
-        <w:instrText xml:space="preserve"> REF _Numd19e8086 \h </w:instrText>
+        <w:instrText xml:space="preserve"> REF _Numd19e8098 \h </w:instrText>
       </w:r>
       <w:r>
         <w:fldChar w:fldCharType="separate"/>
@@ -2145,7 +2145,7 @@
         <w:rPr>
           <w:color w:val="0000FF"/>
         </w:rPr>
-        <w:instrText xml:space="preserve"> REF _Numd19e8099 \h </w:instrText>
+        <w:instrText xml:space="preserve"> REF _Numd19e8111 \h </w:instrText>
       </w:r>
       <w:r>
         <w:fldChar w:fldCharType="separate"/>
@@ -2191,7 +2191,7 @@
         <w:rPr>
           <w:color w:val="0000FF"/>
         </w:rPr>
-        <w:instrText xml:space="preserve"> REF _Numd19e8152 \h </w:instrText>
+        <w:instrText xml:space="preserve"> REF _Numd19e8164 \h </w:instrText>
       </w:r>
       <w:r>
         <w:fldChar w:fldCharType="separate"/>
@@ -2237,7 +2237,7 @@
         <w:rPr>
           <w:color w:val="0000FF"/>
         </w:rPr>
-        <w:instrText xml:space="preserve"> REF _Numd19e8165 \h </w:instrText>
+        <w:instrText xml:space="preserve"> REF _Numd19e8177 \h </w:instrText>
       </w:r>
       <w:r>
         <w:fldChar w:fldCharType="separate"/>
@@ -2283,7 +2283,7 @@
         <w:rPr>
           <w:color w:val="0000FF"/>
         </w:rPr>
-        <w:instrText xml:space="preserve"> REF _Numd19e8202 \h </w:instrText>
+        <w:instrText xml:space="preserve"> REF _Numd19e8214 \h </w:instrText>
       </w:r>
       <w:r>
         <w:fldChar w:fldCharType="separate"/>
@@ -2329,7 +2329,7 @@
         <w:rPr>
           <w:color w:val="0000FF"/>
         </w:rPr>
-        <w:instrText xml:space="preserve"> REF _Numd19e8358 \h </w:instrText>
+        <w:instrText xml:space="preserve"> REF _Numd19e8370 \h </w:instrText>
       </w:r>
       <w:r>
         <w:fldChar w:fldCharType="separate"/>
@@ -2375,7 +2375,7 @@
         <w:rPr>
           <w:color w:val="0000FF"/>
         </w:rPr>
-        <w:instrText xml:space="preserve"> REF _Numd19e8529 \h </w:instrText>
+        <w:instrText xml:space="preserve"> REF _Numd19e8541 \h </w:instrText>
       </w:r>
       <w:r>
         <w:fldChar w:fldCharType="separate"/>
@@ -2421,7 +2421,7 @@
         <w:rPr>
           <w:color w:val="0000FF"/>
         </w:rPr>
-        <w:instrText xml:space="preserve"> REF _Numd19e8542 \h </w:instrText>
+        <w:instrText xml:space="preserve"> REF _Numd19e8554 \h </w:instrText>
       </w:r>
       <w:r>
         <w:fldChar w:fldCharType="separate"/>
@@ -2467,7 +2467,7 @@
         <w:rPr>
           <w:color w:val="0000FF"/>
         </w:rPr>
-        <w:instrText xml:space="preserve"> REF _Numd19e8565 \h </w:instrText>
+        <w:instrText xml:space="preserve"> REF _Numd19e8577 \h </w:instrText>
       </w:r>
       <w:r>
         <w:fldChar w:fldCharType="separate"/>
@@ -2513,7 +2513,7 @@
         <w:rPr>
           <w:color w:val="0000FF"/>
         </w:rPr>
-        <w:instrText xml:space="preserve"> REF _Numd19e8620 \h </w:instrText>
+        <w:instrText xml:space="preserve"> REF _Numd19e8632 \h </w:instrText>
       </w:r>
       <w:r>
         <w:fldChar w:fldCharType="separate"/>
@@ -2559,7 +2559,7 @@
         <w:rPr>
           <w:color w:val="0000FF"/>
         </w:rPr>
-        <w:instrText xml:space="preserve"> REF _Numd19e8661 \h </w:instrText>
+        <w:instrText xml:space="preserve"> REF _Numd19e8673 \h </w:instrText>
       </w:r>
       <w:r>
         <w:fldChar w:fldCharType="separate"/>
@@ -2605,7 +2605,7 @@
         <w:rPr>
           <w:color w:val="0000FF"/>
         </w:rPr>
-        <w:instrText xml:space="preserve"> REF _Numd19e8681 \h </w:instrText>
+        <w:instrText xml:space="preserve"> REF _Numd19e8693 \h </w:instrText>
       </w:r>
       <w:r>
         <w:fldChar w:fldCharType="separate"/>
@@ -2651,7 +2651,7 @@
         <w:rPr>
           <w:color w:val="0000FF"/>
         </w:rPr>
-        <w:instrText xml:space="preserve"> REF _Numd19e8732 \h </w:instrText>
+        <w:instrText xml:space="preserve"> REF _Numd19e8744 \h </w:instrText>
       </w:r>
       <w:r>
         <w:fldChar w:fldCharType="separate"/>
@@ -2697,7 +2697,7 @@
         <w:rPr>
           <w:color w:val="0000FF"/>
         </w:rPr>
-        <w:instrText xml:space="preserve"> REF _Numd19e8745 \h </w:instrText>
+        <w:instrText xml:space="preserve"> REF _Numd19e8757 \h </w:instrText>
       </w:r>
       <w:r>
         <w:fldChar w:fldCharType="separate"/>
@@ -2743,7 +2743,7 @@
         <w:rPr>
           <w:color w:val="0000FF"/>
         </w:rPr>
-        <w:instrText xml:space="preserve"> REF _Numd19e8764 \h </w:instrText>
+        <w:instrText xml:space="preserve"> REF _Numd19e8776 \h </w:instrText>
       </w:r>
       <w:r>
         <w:fldChar w:fldCharType="separate"/>
@@ -2789,7 +2789,7 @@
         <w:rPr>
           <w:color w:val="0000FF"/>
         </w:rPr>
-        <w:instrText xml:space="preserve"> REF _Numd19e8785 \h </w:instrText>
+        <w:instrText xml:space="preserve"> REF _Numd19e8797 \h </w:instrText>
       </w:r>
       <w:r>
         <w:fldChar w:fldCharType="separate"/>
@@ -2835,7 +2835,7 @@
         <w:rPr>
           <w:color w:val="0000FF"/>
         </w:rPr>
-        <w:instrText xml:space="preserve"> REF _Numd19e8822 \h </w:instrText>
+        <w:instrText xml:space="preserve"> REF _Numd19e8834 \h </w:instrText>
       </w:r>
       <w:r>
         <w:fldChar w:fldCharType="separate"/>
@@ -2881,7 +2881,7 @@
         <w:rPr>
           <w:color w:val="0000FF"/>
         </w:rPr>
-        <w:instrText xml:space="preserve"> REF _Numd19e8861 \h </w:instrText>
+        <w:instrText xml:space="preserve"> REF _Numd19e8873 \h </w:instrText>
       </w:r>
       <w:r>
         <w:fldChar w:fldCharType="separate"/>
@@ -2927,7 +2927,7 @@
         <w:rPr>
           <w:color w:val="0000FF"/>
         </w:rPr>
-        <w:instrText xml:space="preserve"> REF _Numd19e8940 \h </w:instrText>
+        <w:instrText xml:space="preserve"> REF _Numd19e8952 \h </w:instrText>
       </w:r>
       <w:r>
         <w:fldChar w:fldCharType="separate"/>
@@ -2973,7 +2973,7 @@
         <w:rPr>
           <w:color w:val="0000FF"/>
         </w:rPr>
-        <w:instrText xml:space="preserve"> REF _Numd19e8972 \h </w:instrText>
+        <w:instrText xml:space="preserve"> REF _Numd19e8984 \h </w:instrText>
       </w:r>
       <w:r>
         <w:fldChar w:fldCharType="separate"/>
@@ -3019,7 +3019,7 @@
         <w:rPr>
           <w:color w:val="0000FF"/>
         </w:rPr>
-        <w:instrText xml:space="preserve"> REF _Numd19e8991 \h </w:instrText>
+        <w:instrText xml:space="preserve"> REF _Numd19e9003 \h </w:instrText>
       </w:r>
       <w:r>
         <w:fldChar w:fldCharType="separate"/>
@@ -3081,7 +3081,7 @@
         <w:rPr>
           <w:color w:val="0000FF"/>
         </w:rPr>
-        <w:instrText xml:space="preserve"> REF _Numd19e7025 \h </w:instrText>
+        <w:instrText xml:space="preserve"> REF _Numd19e7037 \h </w:instrText>
       </w:r>
       <w:r>
         <w:fldChar w:fldCharType="separate"/>
@@ -3114,7 +3114,7 @@
         <w:rPr>
           <w:color w:val="0000FF"/>
         </w:rPr>
-        <w:instrText xml:space="preserve"> REF _Numd19e7298 \h </w:instrText>
+        <w:instrText xml:space="preserve"> REF _Numd19e7310 \h </w:instrText>
       </w:r>
       <w:r>
         <w:fldChar w:fldCharType="separate"/>
@@ -3147,7 +3147,7 @@
         <w:rPr>
           <w:color w:val="0000FF"/>
         </w:rPr>
-        <w:instrText xml:space="preserve"> REF _Numd19e7585 \h </w:instrText>
+        <w:instrText xml:space="preserve"> REF _Numd19e7597 \h </w:instrText>
       </w:r>
       <w:r>
         <w:fldChar w:fldCharType="separate"/>
@@ -3230,7 +3230,7 @@
         <w:rPr>
           <w:color w:val="0000FF"/>
         </w:rPr>
-        <w:instrText xml:space="preserve"> REF _Numd19e7311 \h </w:instrText>
+        <w:instrText xml:space="preserve"> REF _Numd19e7323 \h </w:instrText>
       </w:r>
       <w:r>
         <w:fldChar w:fldCharType="separate"/>
@@ -4617,7 +4617,7 @@
         <w:rPr>
           <w:color w:val="0000FF"/>
         </w:rPr>
-        <w:instrText xml:space="preserve"> REF _Numd19e7298 \h </w:instrText>
+        <w:instrText xml:space="preserve"> REF _Numd19e7310 \h </w:instrText>
       </w:r>
       <w:r>
         <w:fldChar w:fldCharType="separate"/>
@@ -15300,8 +15300,8 @@
           <w:numId w:val="136"/>
         </w:numPr>
       </w:pPr>
-      <w:bookmarkStart w:id="98" w:name="_Tocd19e6565"/>
-      <w:bookmarkStart w:id="97" w:name="_Refd19e6565"/>
+      <w:bookmarkStart w:id="98" w:name="_Tocd19e6567"/>
+      <w:bookmarkStart w:id="97" w:name="_Refd19e6567"/>
       <w:r>
         <w:t/>
       </w:r>
@@ -15370,8 +15370,8 @@
           <w:numId w:val="137"/>
         </w:numPr>
       </w:pPr>
-      <w:bookmarkStart w:id="100" w:name="_Tocd19e6588"/>
-      <w:bookmarkStart w:id="99" w:name="_Refd19e6588"/>
+      <w:bookmarkStart w:id="100" w:name="_Tocd19e6593"/>
+      <w:bookmarkStart w:id="99" w:name="_Refd19e6593"/>
       <w:r>
         <w:t/>
       </w:r>
@@ -15539,13 +15539,7 @@
         </w:r>
       </w:hyperlink>
       <w:r>
-        <w:t xml:space="preserve"> (search FAR Case </w:t>
-      </w:r>
-      <w:r>
-        <w:t>2024-001</w:t>
-      </w:r>
-      <w:r>
-        <w:t>, open the docket folder, and go to the supporting documents file).</w:t>
+        <w:t xml:space="preserve"> (search FAR Case 2024-001, open the docket folder, and go to the supporting documents file).</w:t>
       </w:r>
       <w:bookmarkEnd w:id="97"/>
       <w:bookmarkEnd w:id="98"/>
@@ -15555,9 +15549,9 @@
       <w:pPr>
         <w:pStyle w:val="Heading3"/>
       </w:pPr>
-      <w:bookmarkStart w:id="101" w:name="_Numd19e6659"/>
-      <w:bookmarkStart w:id="102" w:name="_Refd19e6659"/>
-      <w:bookmarkStart w:id="103" w:name="_Tocd19e6659"/>
+      <w:bookmarkStart w:id="101" w:name="_Numd19e6671"/>
+      <w:bookmarkStart w:id="102" w:name="_Refd19e6671"/>
+      <w:bookmarkStart w:id="103" w:name="_Tocd19e6671"/>
       <w:r>
         <w:t/>
       </w:r>
@@ -15580,8 +15574,8 @@
           <w:numId w:val="139"/>
         </w:numPr>
       </w:pPr>
-      <w:bookmarkStart w:id="105" w:name="_Tocd19e6668"/>
-      <w:bookmarkStart w:id="104" w:name="_Refd19e6668"/>
+      <w:bookmarkStart w:id="105" w:name="_Tocd19e6680"/>
+      <w:bookmarkStart w:id="104" w:name="_Refd19e6680"/>
       <w:r>
         <w:t/>
       </w:r>
@@ -15637,15 +15631,15 @@
         <w:pStyle w:val="Caption"/>
         <w:keepNext/>
       </w:pPr>
-      <w:bookmarkStart xmlns:tce="http://www.TCE.com" w:id="106" w:name="_Refd19e6691"/>
-      <w:bookmarkStart xmlns:tce="http://www.TCE.com" w:id="107" w:name="_Tocd19e6691"/>
+      <w:bookmarkStart xmlns:tce="http://www.TCE.com" w:id="106" w:name="_Refd19e6703"/>
+      <w:bookmarkStart xmlns:tce="http://www.TCE.com" w:id="107" w:name="_Tocd19e6703"/>
       <w:r>
         <w:t>Table</w:t>
       </w:r>
       <w:r>
         <w:t xml:space="preserve"> </w:t>
       </w:r>
-      <w:bookmarkStart xmlns:tce="http://www.TCE.com" w:id="108" w:name="_Numd19e6691"/>
+      <w:bookmarkStart xmlns:tce="http://www.TCE.com" w:id="108" w:name="_Numd19e6703"/>
       <w:fldSimple w:instr=" SEQ Table \* ARABIC ">
         <w:r>
           <w:rPr>
@@ -16424,9 +16418,9 @@
       <w:pPr>
         <w:pStyle w:val="Heading2"/>
       </w:pPr>
-      <w:bookmarkStart w:id="109" w:name="_Numd19e7025"/>
-      <w:bookmarkStart w:id="110" w:name="_Refd19e7025"/>
-      <w:bookmarkStart w:id="111" w:name="_Tocd19e7025"/>
+      <w:bookmarkStart w:id="109" w:name="_Numd19e7037"/>
+      <w:bookmarkStart w:id="110" w:name="_Refd19e7037"/>
+      <w:bookmarkStart w:id="111" w:name="_Tocd19e7037"/>
       <w:r>
         <w:t/>
       </w:r>
@@ -16445,9 +16439,9 @@
       <w:pPr>
         <w:pStyle w:val="Heading3"/>
       </w:pPr>
-      <w:bookmarkStart w:id="112" w:name="_Numd19e7038"/>
-      <w:bookmarkStart w:id="113" w:name="_Refd19e7038"/>
-      <w:bookmarkStart w:id="114" w:name="_Tocd19e7038"/>
+      <w:bookmarkStart w:id="112" w:name="_Numd19e7050"/>
+      <w:bookmarkStart w:id="113" w:name="_Refd19e7050"/>
+      <w:bookmarkStart w:id="114" w:name="_Tocd19e7050"/>
       <w:r>
         <w:t/>
       </w:r>
@@ -16466,9 +16460,9 @@
       <w:pPr>
         <w:pStyle w:val="Heading4"/>
       </w:pPr>
-      <w:bookmarkStart w:id="115" w:name="_Numd19e7051"/>
-      <w:bookmarkStart w:id="116" w:name="_Refd19e7051"/>
-      <w:bookmarkStart w:id="117" w:name="_Tocd19e7051"/>
+      <w:bookmarkStart w:id="115" w:name="_Numd19e7063"/>
+      <w:bookmarkStart w:id="116" w:name="_Refd19e7063"/>
+      <w:bookmarkStart w:id="117" w:name="_Tocd19e7063"/>
       <w:r>
         <w:t/>
       </w:r>
@@ -16491,8 +16485,8 @@
           <w:numId w:val="140"/>
         </w:numPr>
       </w:pPr>
-      <w:bookmarkStart w:id="119" w:name="_Tocd19e7060"/>
-      <w:bookmarkStart w:id="118" w:name="_Refd19e7060"/>
+      <w:bookmarkStart w:id="119" w:name="_Tocd19e7072"/>
+      <w:bookmarkStart w:id="118" w:name="_Refd19e7072"/>
       <w:r>
         <w:t/>
       </w:r>
@@ -16545,8 +16539,8 @@
           <w:numId w:val="141"/>
         </w:numPr>
       </w:pPr>
-      <w:bookmarkStart w:id="121" w:name="_Tocd19e7072"/>
-      <w:bookmarkStart w:id="120" w:name="_Refd19e7072"/>
+      <w:bookmarkStart w:id="121" w:name="_Tocd19e7084"/>
+      <w:bookmarkStart w:id="120" w:name="_Refd19e7084"/>
       <w:r>
         <w:t/>
       </w:r>
@@ -16625,10 +16619,10 @@
           <w:numId w:val="142"/>
         </w:numPr>
       </w:pPr>
-      <w:bookmarkStart w:id="125" w:name="_Tocd19e7104"/>
-      <w:bookmarkStart w:id="124" w:name="_Refd19e7104"/>
-      <w:bookmarkStart w:id="123" w:name="_Tocd19e7102"/>
-      <w:bookmarkStart w:id="122" w:name="_Refd19e7102"/>
+      <w:bookmarkStart w:id="125" w:name="_Tocd19e7116"/>
+      <w:bookmarkStart w:id="124" w:name="_Refd19e7116"/>
+      <w:bookmarkStart w:id="123" w:name="_Tocd19e7114"/>
+      <w:bookmarkStart w:id="122" w:name="_Refd19e7114"/>
       <w:r>
         <w:t/>
       </w:r>
@@ -16728,8 +16722,8 @@
           <w:numId w:val="143"/>
         </w:numPr>
       </w:pPr>
-      <w:bookmarkStart w:id="127" w:name="_Tocd19e7139"/>
-      <w:bookmarkStart w:id="126" w:name="_Refd19e7139"/>
+      <w:bookmarkStart w:id="127" w:name="_Tocd19e7151"/>
+      <w:bookmarkStart w:id="126" w:name="_Refd19e7151"/>
       <w:r>
         <w:t/>
       </w:r>
@@ -16768,7 +16762,7 @@
         <w:rPr>
           <w:color w:val="0000FF"/>
         </w:rPr>
-        <w:instrText xml:space="preserve"> REF _Numd19e7207 \h </w:instrText>
+        <w:instrText xml:space="preserve"> REF _Numd19e7219 \h </w:instrText>
       </w:r>
       <w:r>
         <w:fldChar w:fldCharType="separate"/>
@@ -16801,7 +16795,7 @@
         <w:rPr>
           <w:color w:val="0000FF"/>
         </w:rPr>
-        <w:instrText xml:space="preserve"> REF _Numd19e7946 \h </w:instrText>
+        <w:instrText xml:space="preserve"> REF _Numd19e7958 \h </w:instrText>
       </w:r>
       <w:r>
         <w:fldChar w:fldCharType="separate"/>
@@ -16928,9 +16922,9 @@
       <w:pPr>
         <w:pStyle w:val="Heading4"/>
       </w:pPr>
-      <w:bookmarkStart w:id="128" w:name="_Numd19e7207"/>
-      <w:bookmarkStart w:id="129" w:name="_Refd19e7207"/>
-      <w:bookmarkStart w:id="130" w:name="_Tocd19e7207"/>
+      <w:bookmarkStart w:id="128" w:name="_Numd19e7219"/>
+      <w:bookmarkStart w:id="129" w:name="_Refd19e7219"/>
+      <w:bookmarkStart w:id="130" w:name="_Tocd19e7219"/>
       <w:r>
         <w:t/>
       </w:r>
@@ -16953,8 +16947,8 @@
           <w:numId w:val="144"/>
         </w:numPr>
       </w:pPr>
-      <w:bookmarkStart w:id="132" w:name="_Tocd19e7216"/>
-      <w:bookmarkStart w:id="131" w:name="_Refd19e7216"/>
+      <w:bookmarkStart w:id="132" w:name="_Tocd19e7228"/>
+      <w:bookmarkStart w:id="131" w:name="_Refd19e7228"/>
       <w:r>
         <w:t/>
       </w:r>
@@ -17002,8 +16996,8 @@
           <w:numId w:val="145"/>
         </w:numPr>
       </w:pPr>
-      <w:bookmarkStart w:id="134" w:name="_Tocd19e7234"/>
-      <w:bookmarkStart w:id="133" w:name="_Refd19e7234"/>
+      <w:bookmarkStart w:id="134" w:name="_Tocd19e7246"/>
+      <w:bookmarkStart w:id="133" w:name="_Refd19e7246"/>
       <w:r>
         <w:t/>
       </w:r>
@@ -17080,9 +17074,9 @@
       <w:pPr>
         <w:pStyle w:val="Heading3"/>
       </w:pPr>
-      <w:bookmarkStart w:id="135" w:name="_Numd19e7274"/>
-      <w:bookmarkStart w:id="136" w:name="_Refd19e7274"/>
-      <w:bookmarkStart w:id="137" w:name="_Tocd19e7274"/>
+      <w:bookmarkStart w:id="135" w:name="_Numd19e7286"/>
+      <w:bookmarkStart w:id="136" w:name="_Refd19e7286"/>
+      <w:bookmarkStart w:id="137" w:name="_Tocd19e7286"/>
       <w:r>
         <w:t/>
       </w:r>
@@ -17113,7 +17107,7 @@
         <w:rPr>
           <w:color w:val="0000FF"/>
         </w:rPr>
-        <w:instrText xml:space="preserve"> REF _Numd19e7517 \h </w:instrText>
+        <w:instrText xml:space="preserve"> REF _Numd19e7529 \h </w:instrText>
       </w:r>
       <w:r>
         <w:fldChar w:fldCharType="separate"/>
@@ -17142,9 +17136,9 @@
       <w:pPr>
         <w:pStyle w:val="Heading2"/>
       </w:pPr>
-      <w:bookmarkStart w:id="138" w:name="_Numd19e7298"/>
-      <w:bookmarkStart w:id="139" w:name="_Refd19e7298"/>
-      <w:bookmarkStart w:id="140" w:name="_Tocd19e7298"/>
+      <w:bookmarkStart w:id="138" w:name="_Numd19e7310"/>
+      <w:bookmarkStart w:id="139" w:name="_Refd19e7310"/>
+      <w:bookmarkStart w:id="140" w:name="_Tocd19e7310"/>
       <w:r>
         <w:t/>
       </w:r>
@@ -17163,9 +17157,9 @@
       <w:pPr>
         <w:pStyle w:val="Heading3"/>
       </w:pPr>
-      <w:bookmarkStart w:id="141" w:name="_Numd19e7311"/>
-      <w:bookmarkStart w:id="142" w:name="_Refd19e7311"/>
-      <w:bookmarkStart w:id="143" w:name="_Tocd19e7311"/>
+      <w:bookmarkStart w:id="141" w:name="_Numd19e7323"/>
+      <w:bookmarkStart w:id="142" w:name="_Refd19e7323"/>
+      <w:bookmarkStart w:id="143" w:name="_Tocd19e7323"/>
       <w:r>
         <w:t/>
       </w:r>
@@ -17188,8 +17182,8 @@
           <w:numId w:val="146"/>
         </w:numPr>
       </w:pPr>
-      <w:bookmarkStart w:id="145" w:name="_Tocd19e7320"/>
-      <w:bookmarkStart w:id="144" w:name="_Refd19e7320"/>
+      <w:bookmarkStart w:id="145" w:name="_Tocd19e7332"/>
+      <w:bookmarkStart w:id="144" w:name="_Refd19e7332"/>
       <w:r>
         <w:t/>
       </w:r>
@@ -17209,8 +17203,8 @@
           <w:numId w:val="147"/>
         </w:numPr>
       </w:pPr>
-      <w:bookmarkStart w:id="147" w:name="_Tocd19e7328"/>
-      <w:bookmarkStart w:id="146" w:name="_Refd19e7328"/>
+      <w:bookmarkStart w:id="147" w:name="_Tocd19e7340"/>
+      <w:bookmarkStart w:id="146" w:name="_Refd19e7340"/>
       <w:r>
         <w:t/>
       </w:r>
@@ -17288,7 +17282,7 @@
         <w:rPr>
           <w:color w:val="0000FF"/>
         </w:rPr>
-        <w:instrText xml:space="preserve"> REF _Numd19e7898 \h </w:instrText>
+        <w:instrText xml:space="preserve"> REF _Numd19e7910 \h </w:instrText>
       </w:r>
       <w:r>
         <w:fldChar w:fldCharType="separate"/>
@@ -17321,7 +17315,7 @@
         <w:rPr>
           <w:color w:val="0000FF"/>
         </w:rPr>
-        <w:instrText xml:space="preserve"> REF _Numd19e7311 \h </w:instrText>
+        <w:instrText xml:space="preserve"> REF _Numd19e7323 \h </w:instrText>
       </w:r>
       <w:r>
         <w:fldChar w:fldCharType="separate"/>
@@ -17465,8 +17459,8 @@
           <w:numId w:val="148"/>
         </w:numPr>
       </w:pPr>
-      <w:bookmarkStart w:id="149" w:name="_Tocd19e7398"/>
-      <w:bookmarkStart w:id="148" w:name="_Refd19e7398"/>
+      <w:bookmarkStart w:id="149" w:name="_Tocd19e7410"/>
+      <w:bookmarkStart w:id="148" w:name="_Refd19e7410"/>
       <w:r>
         <w:t/>
       </w:r>
@@ -17524,9 +17518,9 @@
       <w:pPr>
         <w:pStyle w:val="Heading3"/>
       </w:pPr>
-      <w:bookmarkStart w:id="150" w:name="_Numd19e7430"/>
-      <w:bookmarkStart w:id="151" w:name="_Refd19e7430"/>
-      <w:bookmarkStart w:id="152" w:name="_Tocd19e7430"/>
+      <w:bookmarkStart w:id="150" w:name="_Numd19e7442"/>
+      <w:bookmarkStart w:id="151" w:name="_Refd19e7442"/>
+      <w:bookmarkStart w:id="152" w:name="_Tocd19e7442"/>
       <w:r>
         <w:t/>
       </w:r>
@@ -17557,8 +17551,8 @@
           <w:numId w:val="149"/>
         </w:numPr>
       </w:pPr>
-      <w:bookmarkStart w:id="154" w:name="_Tocd19e7441"/>
-      <w:bookmarkStart w:id="153" w:name="_Refd19e7441"/>
+      <w:bookmarkStart w:id="154" w:name="_Tocd19e7453"/>
+      <w:bookmarkStart w:id="153" w:name="_Refd19e7453"/>
       <w:r>
         <w:t/>
       </w:r>
@@ -17595,9 +17589,9 @@
       <w:pPr>
         <w:pStyle w:val="Heading3"/>
       </w:pPr>
-      <w:bookmarkStart w:id="155" w:name="_Numd19e7464"/>
-      <w:bookmarkStart w:id="156" w:name="_Refd19e7464"/>
-      <w:bookmarkStart w:id="157" w:name="_Tocd19e7464"/>
+      <w:bookmarkStart w:id="155" w:name="_Numd19e7476"/>
+      <w:bookmarkStart w:id="156" w:name="_Refd19e7476"/>
+      <w:bookmarkStart w:id="157" w:name="_Tocd19e7476"/>
       <w:r>
         <w:t/>
       </w:r>
@@ -17620,8 +17614,8 @@
           <w:numId w:val="150"/>
         </w:numPr>
       </w:pPr>
-      <w:bookmarkStart w:id="159" w:name="_Tocd19e7473"/>
-      <w:bookmarkStart w:id="158" w:name="_Refd19e7473"/>
+      <w:bookmarkStart w:id="159" w:name="_Tocd19e7485"/>
+      <w:bookmarkStart w:id="158" w:name="_Refd19e7485"/>
       <w:r>
         <w:t/>
       </w:r>
@@ -17720,7 +17714,7 @@
         <w:rPr>
           <w:color w:val="0000FF"/>
         </w:rPr>
-        <w:instrText xml:space="preserve"> REF _Numd19e7311 \h </w:instrText>
+        <w:instrText xml:space="preserve"> REF _Numd19e7323 \h </w:instrText>
       </w:r>
       <w:r>
         <w:fldChar w:fldCharType="separate"/>
@@ -17760,9 +17754,9 @@
       <w:pPr>
         <w:pStyle w:val="Heading3"/>
       </w:pPr>
-      <w:bookmarkStart w:id="160" w:name="_Numd19e7517"/>
-      <w:bookmarkStart w:id="161" w:name="_Refd19e7517"/>
-      <w:bookmarkStart w:id="162" w:name="_Tocd19e7517"/>
+      <w:bookmarkStart w:id="160" w:name="_Numd19e7529"/>
+      <w:bookmarkStart w:id="161" w:name="_Refd19e7529"/>
+      <w:bookmarkStart w:id="162" w:name="_Tocd19e7529"/>
       <w:r>
         <w:t/>
       </w:r>
@@ -17785,8 +17779,8 @@
           <w:numId w:val="151"/>
         </w:numPr>
       </w:pPr>
-      <w:bookmarkStart w:id="164" w:name="_Tocd19e7526"/>
-      <w:bookmarkStart w:id="163" w:name="_Refd19e7526"/>
+      <w:bookmarkStart w:id="164" w:name="_Tocd19e7538"/>
+      <w:bookmarkStart w:id="163" w:name="_Refd19e7538"/>
       <w:r>
         <w:t/>
       </w:r>
@@ -17806,7 +17800,7 @@
         <w:rPr>
           <w:color w:val="0000FF"/>
         </w:rPr>
-        <w:instrText xml:space="preserve"> REF _Numd19e7311 \h </w:instrText>
+        <w:instrText xml:space="preserve"> REF _Numd19e7323 \h </w:instrText>
       </w:r>
       <w:r>
         <w:fldChar w:fldCharType="separate"/>
@@ -17891,8 +17885,8 @@
           <w:numId w:val="152"/>
         </w:numPr>
       </w:pPr>
-      <w:bookmarkStart w:id="166" w:name="_Tocd19e7549"/>
-      <w:bookmarkStart w:id="165" w:name="_Refd19e7549"/>
+      <w:bookmarkStart w:id="166" w:name="_Tocd19e7561"/>
+      <w:bookmarkStart w:id="165" w:name="_Refd19e7561"/>
       <w:r>
         <w:t/>
       </w:r>
@@ -17931,7 +17925,7 @@
         <w:rPr>
           <w:color w:val="0000FF"/>
         </w:rPr>
-        <w:instrText xml:space="preserve"> REF _Numd19e7585 \h </w:instrText>
+        <w:instrText xml:space="preserve"> REF _Numd19e7597 \h </w:instrText>
       </w:r>
       <w:r>
         <w:fldChar w:fldCharType="separate"/>
@@ -17983,9 +17977,9 @@
       <w:pPr>
         <w:pStyle w:val="Heading2"/>
       </w:pPr>
-      <w:bookmarkStart w:id="167" w:name="_Numd19e7585"/>
-      <w:bookmarkStart w:id="168" w:name="_Refd19e7585"/>
-      <w:bookmarkStart w:id="169" w:name="_Tocd19e7585"/>
+      <w:bookmarkStart w:id="167" w:name="_Numd19e7597"/>
+      <w:bookmarkStart w:id="168" w:name="_Refd19e7597"/>
+      <w:bookmarkStart w:id="169" w:name="_Tocd19e7597"/>
       <w:r>
         <w:t/>
       </w:r>
@@ -18004,9 +17998,9 @@
       <w:pPr>
         <w:pStyle w:val="Heading3"/>
       </w:pPr>
-      <w:bookmarkStart w:id="170" w:name="_Numd19e7598"/>
-      <w:bookmarkStart w:id="171" w:name="_Refd19e7598"/>
-      <w:bookmarkStart w:id="172" w:name="_Tocd19e7598"/>
+      <w:bookmarkStart w:id="170" w:name="_Numd19e7610"/>
+      <w:bookmarkStart w:id="171" w:name="_Refd19e7610"/>
+      <w:bookmarkStart w:id="172" w:name="_Tocd19e7610"/>
       <w:r>
         <w:t/>
       </w:r>
@@ -18042,9 +18036,9 @@
       <w:pPr>
         <w:pStyle w:val="Heading3"/>
       </w:pPr>
-      <w:bookmarkStart w:id="173" w:name="_Numd19e7621"/>
-      <w:bookmarkStart w:id="174" w:name="_Refd19e7621"/>
-      <w:bookmarkStart w:id="175" w:name="_Tocd19e7621"/>
+      <w:bookmarkStart w:id="173" w:name="_Numd19e7633"/>
+      <w:bookmarkStart w:id="174" w:name="_Refd19e7633"/>
+      <w:bookmarkStart w:id="175" w:name="_Tocd19e7633"/>
       <w:r>
         <w:t/>
       </w:r>
@@ -18084,8 +18078,8 @@
           <w:numId w:val="153"/>
         </w:numPr>
       </w:pPr>
-      <w:bookmarkStart w:id="177" w:name="_Tocd19e7635"/>
-      <w:bookmarkStart w:id="176" w:name="_Refd19e7635"/>
+      <w:bookmarkStart w:id="177" w:name="_Tocd19e7647"/>
+      <w:bookmarkStart w:id="176" w:name="_Refd19e7647"/>
       <w:r>
         <w:t/>
       </w:r>
@@ -18254,7 +18248,7 @@
         <w:rPr>
           <w:color w:val="0000FF"/>
         </w:rPr>
-        <w:instrText xml:space="preserve"> REF _Numd19e7311 \h </w:instrText>
+        <w:instrText xml:space="preserve"> REF _Numd19e7323 \h </w:instrText>
       </w:r>
       <w:r>
         <w:fldChar w:fldCharType="separate"/>
@@ -18285,9 +18279,9 @@
       <w:pPr>
         <w:pStyle w:val="Heading3"/>
       </w:pPr>
-      <w:bookmarkStart w:id="178" w:name="_Numd19e7715"/>
-      <w:bookmarkStart w:id="179" w:name="_Refd19e7715"/>
-      <w:bookmarkStart w:id="180" w:name="_Tocd19e7715"/>
+      <w:bookmarkStart w:id="178" w:name="_Numd19e7727"/>
+      <w:bookmarkStart w:id="179" w:name="_Refd19e7727"/>
+      <w:bookmarkStart w:id="180" w:name="_Tocd19e7727"/>
       <w:r>
         <w:t/>
       </w:r>
@@ -18370,9 +18364,9 @@
       <w:pPr>
         <w:pStyle w:val="Heading3"/>
       </w:pPr>
-      <w:bookmarkStart w:id="181" w:name="_Numd19e7759"/>
-      <w:bookmarkStart w:id="182" w:name="_Refd19e7759"/>
-      <w:bookmarkStart w:id="183" w:name="_Tocd19e7759"/>
+      <w:bookmarkStart w:id="181" w:name="_Numd19e7771"/>
+      <w:bookmarkStart w:id="182" w:name="_Refd19e7771"/>
+      <w:bookmarkStart w:id="183" w:name="_Tocd19e7771"/>
       <w:r>
         <w:t/>
       </w:r>
@@ -18403,7 +18397,7 @@
         <w:rPr>
           <w:color w:val="0000FF"/>
         </w:rPr>
-        <w:instrText xml:space="preserve"> REF _Numd19e7843 \h </w:instrText>
+        <w:instrText xml:space="preserve"> REF _Numd19e7855 \h </w:instrText>
       </w:r>
       <w:r>
         <w:fldChar w:fldCharType="separate"/>
@@ -18432,9 +18426,9 @@
       <w:pPr>
         <w:pStyle w:val="Heading3"/>
       </w:pPr>
-      <w:bookmarkStart w:id="184" w:name="_Numd19e7781"/>
-      <w:bookmarkStart w:id="185" w:name="_Refd19e7781"/>
-      <w:bookmarkStart w:id="186" w:name="_Tocd19e7781"/>
+      <w:bookmarkStart w:id="184" w:name="_Numd19e7793"/>
+      <w:bookmarkStart w:id="185" w:name="_Refd19e7793"/>
+      <w:bookmarkStart w:id="186" w:name="_Tocd19e7793"/>
       <w:r>
         <w:t/>
       </w:r>
@@ -18465,8 +18459,8 @@
           <w:numId w:val="154"/>
         </w:numPr>
       </w:pPr>
-      <w:bookmarkStart w:id="188" w:name="_Tocd19e7792"/>
-      <w:bookmarkStart w:id="187" w:name="_Refd19e7792"/>
+      <w:bookmarkStart w:id="188" w:name="_Tocd19e7804"/>
+      <w:bookmarkStart w:id="187" w:name="_Refd19e7804"/>
       <w:r>
         <w:t/>
       </w:r>
@@ -18486,7 +18480,7 @@
         <w:rPr>
           <w:color w:val="0000FF"/>
         </w:rPr>
-        <w:instrText xml:space="preserve"> REF _Numd19e7843 \h </w:instrText>
+        <w:instrText xml:space="preserve"> REF _Numd19e7855 \h </w:instrText>
       </w:r>
       <w:r>
         <w:fldChar w:fldCharType="separate"/>
@@ -18519,8 +18513,8 @@
           <w:numId w:val="155"/>
         </w:numPr>
       </w:pPr>
-      <w:bookmarkStart w:id="190" w:name="_Tocd19e7804"/>
-      <w:bookmarkStart w:id="189" w:name="_Refd19e7804"/>
+      <w:bookmarkStart w:id="190" w:name="_Tocd19e7816"/>
+      <w:bookmarkStart w:id="189" w:name="_Refd19e7816"/>
       <w:r>
         <w:t/>
       </w:r>
@@ -18597,9 +18591,9 @@
       <w:pPr>
         <w:pStyle w:val="Heading3"/>
       </w:pPr>
-      <w:bookmarkStart w:id="191" w:name="_Numd19e7843"/>
-      <w:bookmarkStart w:id="192" w:name="_Refd19e7843"/>
-      <w:bookmarkStart w:id="193" w:name="_Tocd19e7843"/>
+      <w:bookmarkStart w:id="191" w:name="_Numd19e7855"/>
+      <w:bookmarkStart w:id="192" w:name="_Refd19e7855"/>
+      <w:bookmarkStart w:id="193" w:name="_Tocd19e7855"/>
       <w:r>
         <w:t/>
       </w:r>
@@ -18622,8 +18616,8 @@
           <w:numId w:val="156"/>
         </w:numPr>
       </w:pPr>
-      <w:bookmarkStart w:id="195" w:name="_Tocd19e7852"/>
-      <w:bookmarkStart w:id="194" w:name="_Refd19e7852"/>
+      <w:bookmarkStart w:id="195" w:name="_Tocd19e7864"/>
+      <w:bookmarkStart w:id="194" w:name="_Refd19e7864"/>
       <w:r>
         <w:t/>
       </w:r>
@@ -18717,9 +18711,9 @@
       <w:pPr>
         <w:pStyle w:val="Heading2"/>
       </w:pPr>
-      <w:bookmarkStart w:id="196" w:name="_Numd19e7898"/>
-      <w:bookmarkStart w:id="197" w:name="_Refd19e7898"/>
-      <w:bookmarkStart w:id="198" w:name="_Tocd19e7898"/>
+      <w:bookmarkStart w:id="196" w:name="_Numd19e7910"/>
+      <w:bookmarkStart w:id="197" w:name="_Refd19e7910"/>
+      <w:bookmarkStart w:id="198" w:name="_Tocd19e7910"/>
       <w:r>
         <w:t/>
       </w:r>
@@ -18738,9 +18732,9 @@
       <w:pPr>
         <w:pStyle w:val="Heading3"/>
       </w:pPr>
-      <w:bookmarkStart w:id="199" w:name="_Numd19e7911"/>
-      <w:bookmarkStart w:id="200" w:name="_Refd19e7911"/>
-      <w:bookmarkStart w:id="201" w:name="_Tocd19e7911"/>
+      <w:bookmarkStart w:id="199" w:name="_Numd19e7923"/>
+      <w:bookmarkStart w:id="200" w:name="_Refd19e7923"/>
+      <w:bookmarkStart w:id="201" w:name="_Tocd19e7923"/>
       <w:r>
         <w:t/>
       </w:r>
@@ -18759,9 +18753,9 @@
       <w:pPr>
         <w:pStyle w:val="Heading4"/>
       </w:pPr>
-      <w:bookmarkStart w:id="202" w:name="_Numd19e7924"/>
-      <w:bookmarkStart w:id="203" w:name="_Refd19e7924"/>
-      <w:bookmarkStart w:id="204" w:name="_Tocd19e7924"/>
+      <w:bookmarkStart w:id="202" w:name="_Numd19e7936"/>
+      <w:bookmarkStart w:id="203" w:name="_Refd19e7936"/>
+      <w:bookmarkStart w:id="204" w:name="_Tocd19e7936"/>
       <w:r>
         <w:t/>
       </w:r>
@@ -18797,9 +18791,9 @@
       <w:pPr>
         <w:pStyle w:val="Heading4"/>
       </w:pPr>
-      <w:bookmarkStart w:id="205" w:name="_Numd19e7946"/>
-      <w:bookmarkStart w:id="206" w:name="_Refd19e7946"/>
-      <w:bookmarkStart w:id="207" w:name="_Tocd19e7946"/>
+      <w:bookmarkStart w:id="205" w:name="_Numd19e7958"/>
+      <w:bookmarkStart w:id="206" w:name="_Refd19e7958"/>
+      <w:bookmarkStart w:id="207" w:name="_Tocd19e7958"/>
       <w:r>
         <w:t/>
       </w:r>
@@ -18822,8 +18816,8 @@
           <w:numId w:val="157"/>
         </w:numPr>
       </w:pPr>
-      <w:bookmarkStart w:id="209" w:name="_Tocd19e7955"/>
-      <w:bookmarkStart w:id="208" w:name="_Refd19e7955"/>
+      <w:bookmarkStart w:id="209" w:name="_Tocd19e7967"/>
+      <w:bookmarkStart w:id="208" w:name="_Refd19e7967"/>
       <w:r>
         <w:t/>
       </w:r>
@@ -18871,8 +18865,8 @@
           <w:numId w:val="158"/>
         </w:numPr>
       </w:pPr>
-      <w:bookmarkStart w:id="211" w:name="_Tocd19e7973"/>
-      <w:bookmarkStart w:id="210" w:name="_Refd19e7973"/>
+      <w:bookmarkStart w:id="211" w:name="_Tocd19e7985"/>
+      <w:bookmarkStart w:id="210" w:name="_Refd19e7985"/>
       <w:r>
         <w:t/>
       </w:r>
@@ -18930,7 +18924,7 @@
         <w:rPr>
           <w:color w:val="0000FF"/>
         </w:rPr>
-        <w:instrText xml:space="preserve"> REF _Numd19e8015 \h </w:instrText>
+        <w:instrText xml:space="preserve"> REF _Numd19e8027 \h </w:instrText>
       </w:r>
       <w:r>
         <w:fldChar w:fldCharType="separate"/>
@@ -18982,9 +18976,9 @@
       <w:pPr>
         <w:pStyle w:val="Heading4"/>
       </w:pPr>
-      <w:bookmarkStart w:id="212" w:name="_Numd19e8015"/>
-      <w:bookmarkStart w:id="213" w:name="_Refd19e8015"/>
-      <w:bookmarkStart w:id="214" w:name="_Tocd19e8015"/>
+      <w:bookmarkStart w:id="212" w:name="_Numd19e8027"/>
+      <w:bookmarkStart w:id="213" w:name="_Refd19e8027"/>
+      <w:bookmarkStart w:id="214" w:name="_Tocd19e8027"/>
       <w:r>
         <w:t/>
       </w:r>
@@ -19007,8 +19001,8 @@
           <w:numId w:val="159"/>
         </w:numPr>
       </w:pPr>
-      <w:bookmarkStart w:id="216" w:name="_Tocd19e8024"/>
-      <w:bookmarkStart w:id="215" w:name="_Refd19e8024"/>
+      <w:bookmarkStart w:id="216" w:name="_Tocd19e8036"/>
+      <w:bookmarkStart w:id="215" w:name="_Refd19e8036"/>
       <w:r>
         <w:t/>
       </w:r>
@@ -19045,9 +19039,9 @@
       <w:pPr>
         <w:pStyle w:val="Heading3"/>
       </w:pPr>
-      <w:bookmarkStart w:id="217" w:name="_Numd19e8049"/>
-      <w:bookmarkStart w:id="218" w:name="_Refd19e8049"/>
-      <w:bookmarkStart w:id="219" w:name="_Tocd19e8049"/>
+      <w:bookmarkStart w:id="217" w:name="_Numd19e8061"/>
+      <w:bookmarkStart w:id="218" w:name="_Refd19e8061"/>
+      <w:bookmarkStart w:id="219" w:name="_Tocd19e8061"/>
       <w:r>
         <w:t/>
       </w:r>
@@ -19074,9 +19068,9 @@
       <w:pPr>
         <w:pStyle w:val="Heading3"/>
       </w:pPr>
-      <w:bookmarkStart w:id="220" w:name="_Numd19e8067"/>
-      <w:bookmarkStart w:id="221" w:name="_Refd19e8067"/>
-      <w:bookmarkStart w:id="222" w:name="_Tocd19e8067"/>
+      <w:bookmarkStart w:id="220" w:name="_Numd19e8079"/>
+      <w:bookmarkStart w:id="221" w:name="_Refd19e8079"/>
+      <w:bookmarkStart w:id="222" w:name="_Tocd19e8079"/>
       <w:r>
         <w:t/>
       </w:r>
@@ -19103,9 +19097,9 @@
       <w:pPr>
         <w:pStyle w:val="Heading2"/>
       </w:pPr>
-      <w:bookmarkStart w:id="223" w:name="_Numd19e8086"/>
-      <w:bookmarkStart w:id="224" w:name="_Refd19e8086"/>
-      <w:bookmarkStart w:id="225" w:name="_Tocd19e8086"/>
+      <w:bookmarkStart w:id="223" w:name="_Numd19e8098"/>
+      <w:bookmarkStart w:id="224" w:name="_Refd19e8098"/>
+      <w:bookmarkStart w:id="225" w:name="_Tocd19e8098"/>
       <w:r>
         <w:t/>
       </w:r>
@@ -19124,9 +19118,9 @@
       <w:pPr>
         <w:pStyle w:val="Heading3"/>
       </w:pPr>
-      <w:bookmarkStart w:id="226" w:name="_Numd19e8099"/>
-      <w:bookmarkStart w:id="227" w:name="_Refd19e8099"/>
-      <w:bookmarkStart w:id="228" w:name="_Tocd19e8099"/>
+      <w:bookmarkStart w:id="226" w:name="_Numd19e8111"/>
+      <w:bookmarkStart w:id="227" w:name="_Refd19e8111"/>
+      <w:bookmarkStart w:id="228" w:name="_Tocd19e8111"/>
       <w:r>
         <w:t/>
       </w:r>
@@ -19149,8 +19143,8 @@
           <w:numId w:val="160"/>
         </w:numPr>
       </w:pPr>
-      <w:bookmarkStart w:id="230" w:name="_Tocd19e8108"/>
-      <w:bookmarkStart w:id="229" w:name="_Refd19e8108"/>
+      <w:bookmarkStart w:id="230" w:name="_Tocd19e8120"/>
+      <w:bookmarkStart w:id="229" w:name="_Refd19e8120"/>
       <w:r>
         <w:t/>
       </w:r>
@@ -19170,7 +19164,7 @@
         <w:rPr>
           <w:color w:val="0000FF"/>
         </w:rPr>
-        <w:instrText xml:space="preserve"> REF _Numd19e8529 \h </w:instrText>
+        <w:instrText xml:space="preserve"> REF _Numd19e8541 \h </w:instrText>
       </w:r>
       <w:r>
         <w:fldChar w:fldCharType="separate"/>
@@ -19222,8 +19216,8 @@
           <w:numId w:val="161"/>
         </w:numPr>
       </w:pPr>
-      <w:bookmarkStart w:id="232" w:name="_Tocd19e8127"/>
-      <w:bookmarkStart w:id="231" w:name="_Refd19e8127"/>
+      <w:bookmarkStart w:id="232" w:name="_Tocd19e8139"/>
+      <w:bookmarkStart w:id="231" w:name="_Refd19e8139"/>
       <w:r>
         <w:t/>
       </w:r>
@@ -19262,9 +19256,9 @@
       <w:pPr>
         <w:pStyle w:val="Heading3"/>
       </w:pPr>
-      <w:bookmarkStart w:id="233" w:name="_Numd19e8152"/>
-      <w:bookmarkStart w:id="234" w:name="_Refd19e8152"/>
-      <w:bookmarkStart w:id="235" w:name="_Tocd19e8152"/>
+      <w:bookmarkStart w:id="233" w:name="_Numd19e8164"/>
+      <w:bookmarkStart w:id="234" w:name="_Refd19e8164"/>
+      <w:bookmarkStart w:id="235" w:name="_Tocd19e8164"/>
       <w:r>
         <w:t/>
       </w:r>
@@ -19283,9 +19277,9 @@
       <w:pPr>
         <w:pStyle w:val="Heading4"/>
       </w:pPr>
-      <w:bookmarkStart w:id="236" w:name="_Numd19e8165"/>
-      <w:bookmarkStart w:id="237" w:name="_Refd19e8165"/>
-      <w:bookmarkStart w:id="238" w:name="_Tocd19e8165"/>
+      <w:bookmarkStart w:id="236" w:name="_Numd19e8177"/>
+      <w:bookmarkStart w:id="237" w:name="_Refd19e8177"/>
+      <w:bookmarkStart w:id="238" w:name="_Tocd19e8177"/>
       <w:r>
         <w:t/>
       </w:r>
@@ -19308,8 +19302,8 @@
           <w:numId w:val="162"/>
         </w:numPr>
       </w:pPr>
-      <w:bookmarkStart w:id="240" w:name="_Tocd19e8174"/>
-      <w:bookmarkStart w:id="239" w:name="_Refd19e8174"/>
+      <w:bookmarkStart w:id="240" w:name="_Tocd19e8186"/>
+      <w:bookmarkStart w:id="239" w:name="_Refd19e8186"/>
       <w:r>
         <w:t/>
       </w:r>
@@ -19329,7 +19323,7 @@
         <w:rPr>
           <w:color w:val="0000FF"/>
         </w:rPr>
-        <w:instrText xml:space="preserve"> REF _Numd19e8542 \h </w:instrText>
+        <w:instrText xml:space="preserve"> REF _Numd19e8554 \h </w:instrText>
       </w:r>
       <w:r>
         <w:fldChar w:fldCharType="separate"/>
@@ -19379,9 +19373,9 @@
       <w:pPr>
         <w:pStyle w:val="Heading4"/>
       </w:pPr>
-      <w:bookmarkStart w:id="241" w:name="_Numd19e8202"/>
-      <w:bookmarkStart w:id="242" w:name="_Refd19e8202"/>
-      <w:bookmarkStart w:id="243" w:name="_Tocd19e8202"/>
+      <w:bookmarkStart w:id="241" w:name="_Numd19e8214"/>
+      <w:bookmarkStart w:id="242" w:name="_Refd19e8214"/>
+      <w:bookmarkStart w:id="243" w:name="_Tocd19e8214"/>
       <w:r>
         <w:t/>
       </w:r>
@@ -19412,8 +19406,8 @@
           <w:numId w:val="163"/>
         </w:numPr>
       </w:pPr>
-      <w:bookmarkStart w:id="245" w:name="_Tocd19e8213"/>
-      <w:bookmarkStart w:id="244" w:name="_Refd19e8213"/>
+      <w:bookmarkStart w:id="245" w:name="_Tocd19e8225"/>
+      <w:bookmarkStart w:id="244" w:name="_Refd19e8225"/>
       <w:r>
         <w:t/>
       </w:r>
@@ -19433,7 +19427,7 @@
         <w:rPr>
           <w:color w:val="0000FF"/>
         </w:rPr>
-        <w:instrText xml:space="preserve"> REF _Numd19e8165 \h </w:instrText>
+        <w:instrText xml:space="preserve"> REF _Numd19e8177 \h </w:instrText>
       </w:r>
       <w:r>
         <w:fldChar w:fldCharType="separate"/>
@@ -19535,8 +19529,8 @@
           <w:numId w:val="164"/>
         </w:numPr>
       </w:pPr>
-      <w:bookmarkStart w:id="247" w:name="_Tocd19e8253"/>
-      <w:bookmarkStart w:id="246" w:name="_Refd19e8253"/>
+      <w:bookmarkStart w:id="247" w:name="_Tocd19e8265"/>
+      <w:bookmarkStart w:id="246" w:name="_Refd19e8265"/>
       <w:r>
         <w:t/>
       </w:r>
@@ -19688,8 +19682,8 @@
           <w:numId w:val="165"/>
         </w:numPr>
       </w:pPr>
-      <w:bookmarkStart w:id="249" w:name="_Tocd19e8312"/>
-      <w:bookmarkStart w:id="248" w:name="_Refd19e8312"/>
+      <w:bookmarkStart w:id="249" w:name="_Tocd19e8324"/>
+      <w:bookmarkStart w:id="248" w:name="_Refd19e8324"/>
       <w:r>
         <w:t/>
       </w:r>
@@ -19787,9 +19781,9 @@
       <w:pPr>
         <w:pStyle w:val="Heading4"/>
       </w:pPr>
-      <w:bookmarkStart w:id="250" w:name="_Numd19e8358"/>
-      <w:bookmarkStart w:id="251" w:name="_Refd19e8358"/>
-      <w:bookmarkStart w:id="252" w:name="_Tocd19e8358"/>
+      <w:bookmarkStart w:id="250" w:name="_Numd19e8370"/>
+      <w:bookmarkStart w:id="251" w:name="_Refd19e8370"/>
+      <w:bookmarkStart w:id="252" w:name="_Tocd19e8370"/>
       <w:r>
         <w:t/>
       </w:r>
@@ -19812,8 +19806,8 @@
           <w:numId w:val="166"/>
         </w:numPr>
       </w:pPr>
-      <w:bookmarkStart w:id="254" w:name="_Tocd19e8367"/>
-      <w:bookmarkStart w:id="253" w:name="_Refd19e8367"/>
+      <w:bookmarkStart w:id="254" w:name="_Tocd19e8379"/>
+      <w:bookmarkStart w:id="253" w:name="_Refd19e8379"/>
       <w:r>
         <w:t/>
       </w:r>
@@ -19899,8 +19893,8 @@
           <w:numId w:val="167"/>
         </w:numPr>
       </w:pPr>
-      <w:bookmarkStart w:id="256" w:name="_Tocd19e8395"/>
-      <w:bookmarkStart w:id="255" w:name="_Refd19e8395"/>
+      <w:bookmarkStart w:id="256" w:name="_Tocd19e8407"/>
+      <w:bookmarkStart w:id="255" w:name="_Refd19e8407"/>
       <w:r>
         <w:t/>
       </w:r>
@@ -19977,7 +19971,7 @@
         <w:rPr>
           <w:color w:val="0000FF"/>
         </w:rPr>
-        <w:instrText xml:space="preserve"> REF _Numd19e8358 \h </w:instrText>
+        <w:instrText xml:space="preserve"> REF _Numd19e8370 \h </w:instrText>
       </w:r>
       <w:r>
         <w:fldChar w:fldCharType="separate"/>
@@ -20079,8 +20073,8 @@
           <w:numId w:val="168"/>
         </w:numPr>
       </w:pPr>
-      <w:bookmarkStart w:id="258" w:name="_Tocd19e8454"/>
-      <w:bookmarkStart w:id="257" w:name="_Refd19e8454"/>
+      <w:bookmarkStart w:id="258" w:name="_Tocd19e8466"/>
+      <w:bookmarkStart w:id="257" w:name="_Refd19e8466"/>
       <w:r>
         <w:t/>
       </w:r>
@@ -20251,9 +20245,9 @@
       <w:pPr>
         <w:pStyle w:val="Heading3"/>
       </w:pPr>
-      <w:bookmarkStart w:id="259" w:name="_Numd19e8529"/>
-      <w:bookmarkStart w:id="260" w:name="_Refd19e8529"/>
-      <w:bookmarkStart w:id="261" w:name="_Tocd19e8529"/>
+      <w:bookmarkStart w:id="259" w:name="_Numd19e8541"/>
+      <w:bookmarkStart w:id="260" w:name="_Refd19e8541"/>
+      <w:bookmarkStart w:id="261" w:name="_Tocd19e8541"/>
       <w:r>
         <w:t/>
       </w:r>
@@ -20272,9 +20266,9 @@
       <w:pPr>
         <w:pStyle w:val="Heading4"/>
       </w:pPr>
-      <w:bookmarkStart w:id="262" w:name="_Numd19e8542"/>
-      <w:bookmarkStart w:id="263" w:name="_Refd19e8542"/>
-      <w:bookmarkStart w:id="264" w:name="_Tocd19e8542"/>
+      <w:bookmarkStart w:id="262" w:name="_Numd19e8554"/>
+      <w:bookmarkStart w:id="263" w:name="_Refd19e8554"/>
+      <w:bookmarkStart w:id="264" w:name="_Tocd19e8554"/>
       <w:r>
         <w:t/>
       </w:r>
@@ -20312,9 +20306,9 @@
       <w:pPr>
         <w:pStyle w:val="Heading4"/>
       </w:pPr>
-      <w:bookmarkStart w:id="265" w:name="_Numd19e8565"/>
-      <w:bookmarkStart w:id="266" w:name="_Refd19e8565"/>
-      <w:bookmarkStart w:id="267" w:name="_Tocd19e8565"/>
+      <w:bookmarkStart w:id="265" w:name="_Numd19e8577"/>
+      <w:bookmarkStart w:id="266" w:name="_Refd19e8577"/>
+      <w:bookmarkStart w:id="267" w:name="_Tocd19e8577"/>
       <w:r>
         <w:t/>
       </w:r>
@@ -20345,8 +20339,8 @@
           <w:numId w:val="169"/>
         </w:numPr>
       </w:pPr>
-      <w:bookmarkStart w:id="269" w:name="_Tocd19e8576"/>
-      <w:bookmarkStart w:id="268" w:name="_Refd19e8576"/>
+      <w:bookmarkStart w:id="269" w:name="_Tocd19e8588"/>
+      <w:bookmarkStart w:id="268" w:name="_Refd19e8588"/>
       <w:r>
         <w:t/>
       </w:r>
@@ -20440,9 +20434,9 @@
       <w:pPr>
         <w:pStyle w:val="Heading4"/>
       </w:pPr>
-      <w:bookmarkStart w:id="270" w:name="_Numd19e8620"/>
-      <w:bookmarkStart w:id="271" w:name="_Refd19e8620"/>
-      <w:bookmarkStart w:id="272" w:name="_Tocd19e8620"/>
+      <w:bookmarkStart w:id="270" w:name="_Numd19e8632"/>
+      <w:bookmarkStart w:id="271" w:name="_Refd19e8632"/>
+      <w:bookmarkStart w:id="272" w:name="_Tocd19e8632"/>
       <w:r>
         <w:t/>
       </w:r>
@@ -20465,8 +20459,8 @@
           <w:numId w:val="170"/>
         </w:numPr>
       </w:pPr>
-      <w:bookmarkStart w:id="274" w:name="_Tocd19e8629"/>
-      <w:bookmarkStart w:id="273" w:name="_Refd19e8629"/>
+      <w:bookmarkStart w:id="274" w:name="_Tocd19e8641"/>
+      <w:bookmarkStart w:id="273" w:name="_Refd19e8641"/>
       <w:r>
         <w:t/>
       </w:r>
@@ -20525,9 +20519,9 @@
       <w:pPr>
         <w:pStyle w:val="Heading4"/>
       </w:pPr>
-      <w:bookmarkStart w:id="275" w:name="_Numd19e8661"/>
-      <w:bookmarkStart w:id="276" w:name="_Refd19e8661"/>
-      <w:bookmarkStart w:id="277" w:name="_Tocd19e8661"/>
+      <w:bookmarkStart w:id="275" w:name="_Numd19e8673"/>
+      <w:bookmarkStart w:id="276" w:name="_Refd19e8673"/>
+      <w:bookmarkStart w:id="277" w:name="_Tocd19e8673"/>
       <w:r>
         <w:t/>
       </w:r>
@@ -20554,9 +20548,9 @@
       <w:pPr>
         <w:pStyle w:val="Heading3"/>
       </w:pPr>
-      <w:bookmarkStart w:id="278" w:name="_Numd19e8681"/>
-      <w:bookmarkStart w:id="279" w:name="_Refd19e8681"/>
-      <w:bookmarkStart w:id="280" w:name="_Tocd19e8681"/>
+      <w:bookmarkStart w:id="278" w:name="_Numd19e8693"/>
+      <w:bookmarkStart w:id="279" w:name="_Refd19e8693"/>
+      <w:bookmarkStart w:id="280" w:name="_Tocd19e8693"/>
       <w:r>
         <w:t/>
       </w:r>
@@ -20587,7 +20581,7 @@
         <w:rPr>
           <w:color w:val="0000FF"/>
         </w:rPr>
-        <w:instrText xml:space="preserve"> REF _Numd19e8202 \h </w:instrText>
+        <w:instrText xml:space="preserve"> REF _Numd19e8214 \h </w:instrText>
       </w:r>
       <w:r>
         <w:fldChar w:fldCharType="separate"/>
@@ -20620,8 +20614,8 @@
           <w:numId w:val="171"/>
         </w:numPr>
       </w:pPr>
-      <w:bookmarkStart w:id="282" w:name="_Tocd19e8696"/>
-      <w:bookmarkStart w:id="281" w:name="_Refd19e8696"/>
+      <w:bookmarkStart w:id="282" w:name="_Tocd19e8708"/>
+      <w:bookmarkStart w:id="281" w:name="_Refd19e8708"/>
       <w:r>
         <w:t/>
       </w:r>
@@ -20660,7 +20654,7 @@
         <w:rPr>
           <w:color w:val="0000FF"/>
         </w:rPr>
-        <w:instrText xml:space="preserve"> REF _Numd19e8202 \h </w:instrText>
+        <w:instrText xml:space="preserve"> REF _Numd19e8214 \h </w:instrText>
       </w:r>
       <w:r>
         <w:fldChar w:fldCharType="separate"/>
@@ -20710,9 +20704,9 @@
       <w:pPr>
         <w:pStyle w:val="Heading2"/>
       </w:pPr>
-      <w:bookmarkStart w:id="283" w:name="_Numd19e8732"/>
-      <w:bookmarkStart w:id="284" w:name="_Refd19e8732"/>
-      <w:bookmarkStart w:id="285" w:name="_Tocd19e8732"/>
+      <w:bookmarkStart w:id="283" w:name="_Numd19e8744"/>
+      <w:bookmarkStart w:id="284" w:name="_Refd19e8744"/>
+      <w:bookmarkStart w:id="285" w:name="_Tocd19e8744"/>
       <w:r>
         <w:t/>
       </w:r>
@@ -20731,9 +20725,9 @@
       <w:pPr>
         <w:pStyle w:val="Heading3"/>
       </w:pPr>
-      <w:bookmarkStart w:id="286" w:name="_Numd19e8745"/>
-      <w:bookmarkStart w:id="287" w:name="_Refd19e8745"/>
-      <w:bookmarkStart w:id="288" w:name="_Tocd19e8745"/>
+      <w:bookmarkStart w:id="286" w:name="_Numd19e8757"/>
+      <w:bookmarkStart w:id="287" w:name="_Refd19e8757"/>
+      <w:bookmarkStart w:id="288" w:name="_Tocd19e8757"/>
       <w:r>
         <w:t/>
       </w:r>
@@ -20760,9 +20754,9 @@
       <w:pPr>
         <w:pStyle w:val="Heading3"/>
       </w:pPr>
-      <w:bookmarkStart w:id="289" w:name="_Numd19e8764"/>
-      <w:bookmarkStart w:id="290" w:name="_Refd19e8764"/>
-      <w:bookmarkStart w:id="291" w:name="_Tocd19e8764"/>
+      <w:bookmarkStart w:id="289" w:name="_Numd19e8776"/>
+      <w:bookmarkStart w:id="290" w:name="_Refd19e8776"/>
+      <w:bookmarkStart w:id="291" w:name="_Tocd19e8776"/>
       <w:r>
         <w:t/>
       </w:r>
@@ -20798,9 +20792,9 @@
       <w:pPr>
         <w:pStyle w:val="Heading3"/>
       </w:pPr>
-      <w:bookmarkStart w:id="292" w:name="_Numd19e8785"/>
-      <w:bookmarkStart w:id="293" w:name="_Refd19e8785"/>
-      <w:bookmarkStart w:id="294" w:name="_Tocd19e8785"/>
+      <w:bookmarkStart w:id="292" w:name="_Numd19e8797"/>
+      <w:bookmarkStart w:id="293" w:name="_Refd19e8797"/>
+      <w:bookmarkStart w:id="294" w:name="_Tocd19e8797"/>
       <w:r>
         <w:t/>
       </w:r>
@@ -20823,8 +20817,8 @@
           <w:numId w:val="172"/>
         </w:numPr>
       </w:pPr>
-      <w:bookmarkStart w:id="296" w:name="_Tocd19e8794"/>
-      <w:bookmarkStart w:id="295" w:name="_Refd19e8794"/>
+      <w:bookmarkStart w:id="296" w:name="_Tocd19e8806"/>
+      <w:bookmarkStart w:id="295" w:name="_Refd19e8806"/>
       <w:r>
         <w:t/>
       </w:r>
@@ -20844,7 +20838,7 @@
         <w:rPr>
           <w:color w:val="0000FF"/>
         </w:rPr>
-        <w:instrText xml:space="preserve"> REF _Numd19e8822 \h </w:instrText>
+        <w:instrText xml:space="preserve"> REF _Numd19e8834 \h </w:instrText>
       </w:r>
       <w:r>
         <w:fldChar w:fldCharType="separate"/>
@@ -20894,9 +20888,9 @@
       <w:pPr>
         <w:pStyle w:val="Heading3"/>
       </w:pPr>
-      <w:bookmarkStart w:id="297" w:name="_Numd19e8822"/>
-      <w:bookmarkStart w:id="298" w:name="_Refd19e8822"/>
-      <w:bookmarkStart w:id="299" w:name="_Tocd19e8822"/>
+      <w:bookmarkStart w:id="297" w:name="_Numd19e8834"/>
+      <w:bookmarkStart w:id="298" w:name="_Refd19e8834"/>
+      <w:bookmarkStart w:id="299" w:name="_Tocd19e8834"/>
       <w:r>
         <w:t/>
       </w:r>
@@ -20919,8 +20913,8 @@
           <w:numId w:val="173"/>
         </w:numPr>
       </w:pPr>
-      <w:bookmarkStart w:id="301" w:name="_Tocd19e8831"/>
-      <w:bookmarkStart w:id="300" w:name="_Refd19e8831"/>
+      <w:bookmarkStart w:id="301" w:name="_Tocd19e8843"/>
+      <w:bookmarkStart w:id="300" w:name="_Refd19e8843"/>
       <w:r>
         <w:t/>
       </w:r>
@@ -20976,9 +20970,9 @@
       <w:pPr>
         <w:pStyle w:val="Heading3"/>
       </w:pPr>
-      <w:bookmarkStart w:id="302" w:name="_Numd19e8861"/>
-      <w:bookmarkStart w:id="303" w:name="_Refd19e8861"/>
-      <w:bookmarkStart w:id="304" w:name="_Tocd19e8861"/>
+      <w:bookmarkStart w:id="302" w:name="_Numd19e8873"/>
+      <w:bookmarkStart w:id="303" w:name="_Refd19e8873"/>
+      <w:bookmarkStart w:id="304" w:name="_Tocd19e8873"/>
       <w:r>
         <w:t/>
       </w:r>
@@ -21009,8 +21003,8 @@
           <w:numId w:val="174"/>
         </w:numPr>
       </w:pPr>
-      <w:bookmarkStart w:id="306" w:name="_Tocd19e8872"/>
-      <w:bookmarkStart w:id="305" w:name="_Refd19e8872"/>
+      <w:bookmarkStart w:id="306" w:name="_Tocd19e8884"/>
+      <w:bookmarkStart w:id="305" w:name="_Refd19e8884"/>
       <w:r>
         <w:t/>
       </w:r>
@@ -21125,7 +21119,7 @@
         <w:rPr>
           <w:color w:val="0000FF"/>
         </w:rPr>
-        <w:instrText xml:space="preserve"> REF _Numd19e8972 \h </w:instrText>
+        <w:instrText xml:space="preserve"> REF _Numd19e8984 \h </w:instrText>
       </w:r>
       <w:r>
         <w:fldChar w:fldCharType="separate"/>
@@ -21177,7 +21171,7 @@
         <w:rPr>
           <w:color w:val="0000FF"/>
         </w:rPr>
-        <w:instrText xml:space="preserve"> REF _Numd19e8991 \h </w:instrText>
+        <w:instrText xml:space="preserve"> REF _Numd19e9003 \h </w:instrText>
       </w:r>
       <w:r>
         <w:fldChar w:fldCharType="separate"/>
@@ -21208,9 +21202,9 @@
       <w:pPr>
         <w:pStyle w:val="Heading3"/>
       </w:pPr>
-      <w:bookmarkStart w:id="307" w:name="_Numd19e8940"/>
-      <w:bookmarkStart w:id="308" w:name="_Refd19e8940"/>
-      <w:bookmarkStart w:id="309" w:name="_Tocd19e8940"/>
+      <w:bookmarkStart w:id="307" w:name="_Numd19e8952"/>
+      <w:bookmarkStart w:id="308" w:name="_Refd19e8952"/>
+      <w:bookmarkStart w:id="309" w:name="_Tocd19e8952"/>
       <w:r>
         <w:t/>
       </w:r>
@@ -21233,8 +21227,8 @@
           <w:numId w:val="175"/>
         </w:numPr>
       </w:pPr>
-      <w:bookmarkStart w:id="311" w:name="_Tocd19e8949"/>
-      <w:bookmarkStart w:id="310" w:name="_Refd19e8949"/>
+      <w:bookmarkStart w:id="311" w:name="_Tocd19e8961"/>
+      <w:bookmarkStart w:id="310" w:name="_Refd19e8961"/>
       <w:r>
         <w:t/>
       </w:r>
@@ -21271,9 +21265,9 @@
       <w:pPr>
         <w:pStyle w:val="Heading3"/>
       </w:pPr>
-      <w:bookmarkStart w:id="312" w:name="_Numd19e8972"/>
-      <w:bookmarkStart w:id="313" w:name="_Refd19e8972"/>
-      <w:bookmarkStart w:id="314" w:name="_Tocd19e8972"/>
+      <w:bookmarkStart w:id="312" w:name="_Numd19e8984"/>
+      <w:bookmarkStart w:id="313" w:name="_Refd19e8984"/>
+      <w:bookmarkStart w:id="314" w:name="_Tocd19e8984"/>
       <w:r>
         <w:t/>
       </w:r>
@@ -21300,9 +21294,9 @@
       <w:pPr>
         <w:pStyle w:val="Heading3"/>
       </w:pPr>
-      <w:bookmarkStart w:id="315" w:name="_Numd19e8991"/>
-      <w:bookmarkStart w:id="316" w:name="_Refd19e8991"/>
-      <w:bookmarkStart w:id="317" w:name="_Tocd19e8991"/>
+      <w:bookmarkStart w:id="315" w:name="_Numd19e9003"/>
+      <w:bookmarkStart w:id="316" w:name="_Refd19e9003"/>
+      <w:bookmarkStart w:id="317" w:name="_Tocd19e9003"/>
       <w:r>
         <w:t/>
       </w:r>
@@ -21528,7 +21522,7 @@
         <w:rPr>
           <w:noProof/>
         </w:rPr>
-        <w:t>5302.101   Definitions</w:t>
+        <w:t>Heading 3</w:t>
       </w:r>
     </w:fldSimple>
   </w:p>
@@ -30636,7 +30630,7 @@
   <w:style w:type="paragraph" w:default="1" w:styleId="Normal">
     <w:name w:val="Normal"/>
     <w:qFormat/>
-    <w:rsid w:val="00792F9E"/>
+    <w:rsid w:val="0035396F"/>
     <w:rPr>
       <w:rFonts w:ascii="Times New Roman" w:hAnsi="Times New Roman"/>
     </w:rPr>
@@ -30753,67 +30747,42 @@
   </w:style>
   <w:style w:type="paragraph" w:styleId="Heading6">
     <w:name w:val="heading 6"/>
-    <w:basedOn w:val="Normal"/>
+    <w:basedOn w:val="Heading4"/>
     <w:next w:val="BodyText"/>
     <w:link w:val="Heading6Char"/>
     <w:uiPriority w:val="9"/>
     <w:unhideWhenUsed/>
     <w:qFormat/>
-    <w:rsid w:val="00D068E1"/>
+    <w:rsid w:val="002D4362"/>
     <w:pPr>
-      <w:keepNext/>
-      <w:keepLines/>
-      <w:spacing w:before="40"/>
       <w:outlineLvl w:val="5"/>
     </w:pPr>
-    <w:rPr>
-      <w:rFonts w:eastAsiaTheme="majorEastAsia" w:cstheme="majorBidi"/>
-      <w:color w:val="1F3763" w:themeColor="accent1" w:themeShade="7F"/>
-    </w:rPr>
   </w:style>
   <w:style w:type="paragraph" w:styleId="Heading7">
     <w:name w:val="heading 7"/>
-    <w:basedOn w:val="Normal"/>
+    <w:basedOn w:val="Heading6"/>
     <w:next w:val="BodyText"/>
     <w:link w:val="Heading7Char"/>
     <w:uiPriority w:val="9"/>
     <w:unhideWhenUsed/>
     <w:qFormat/>
-    <w:rsid w:val="005043CB"/>
+    <w:rsid w:val="002D4362"/>
     <w:pPr>
-      <w:keepNext/>
-      <w:keepLines/>
-      <w:spacing w:before="40"/>
       <w:outlineLvl w:val="6"/>
     </w:pPr>
-    <w:rPr>
-      <w:rFonts w:asciiTheme="majorHAnsi" w:eastAsiaTheme="majorEastAsia" w:hAnsiTheme="majorHAnsi" w:cstheme="majorBidi"/>
-      <w:i/>
-      <w:iCs/>
-      <w:color w:val="1F3763" w:themeColor="accent1" w:themeShade="7F"/>
-    </w:rPr>
   </w:style>
   <w:style w:type="paragraph" w:styleId="Heading8">
     <w:name w:val="heading 8"/>
-    <w:basedOn w:val="Normal"/>
+    <w:basedOn w:val="Heading7"/>
     <w:next w:val="BodyText"/>
     <w:link w:val="Heading8Char"/>
     <w:uiPriority w:val="9"/>
     <w:unhideWhenUsed/>
     <w:qFormat/>
-    <w:rsid w:val="005043CB"/>
+    <w:rsid w:val="002D4362"/>
     <w:pPr>
-      <w:keepNext/>
-      <w:keepLines/>
-      <w:spacing w:before="40"/>
       <w:outlineLvl w:val="7"/>
     </w:pPr>
-    <w:rPr>
-      <w:rFonts w:asciiTheme="majorHAnsi" w:eastAsiaTheme="majorEastAsia" w:hAnsiTheme="majorHAnsi" w:cstheme="majorBidi"/>
-      <w:color w:val="272727" w:themeColor="text1" w:themeTint="D8"/>
-      <w:sz w:val="21"/>
-      <w:szCs w:val="21"/>
-    </w:rPr>
   </w:style>
   <w:style w:type="paragraph" w:styleId="Heading9">
     <w:name w:val="heading 9"/>
@@ -31064,10 +31033,11 @@
     <w:basedOn w:val="DefaultParagraphFont"/>
     <w:link w:val="Heading6"/>
     <w:uiPriority w:val="9"/>
-    <w:rsid w:val="00D068E1"/>
+    <w:rsid w:val="002D4362"/>
     <w:rPr>
       <w:rFonts w:ascii="Times New Roman" w:eastAsiaTheme="majorEastAsia" w:hAnsi="Times New Roman" w:cstheme="majorBidi"/>
-      <w:color w:val="1F3763" w:themeColor="accent1" w:themeShade="7F"/>
+      <w:b/>
+      <w:iCs/>
     </w:rPr>
   </w:style>
   <w:style w:type="character" w:customStyle="1" w:styleId="Heading7Char">
@@ -31075,12 +31045,11 @@
     <w:basedOn w:val="DefaultParagraphFont"/>
     <w:link w:val="Heading7"/>
     <w:uiPriority w:val="9"/>
-    <w:rsid w:val="005043CB"/>
+    <w:rsid w:val="002D4362"/>
     <w:rPr>
-      <w:rFonts w:asciiTheme="majorHAnsi" w:eastAsiaTheme="majorEastAsia" w:hAnsiTheme="majorHAnsi" w:cstheme="majorBidi"/>
-      <w:i/>
+      <w:rFonts w:ascii="Times New Roman" w:eastAsiaTheme="majorEastAsia" w:hAnsi="Times New Roman" w:cstheme="majorBidi"/>
+      <w:b/>
       <w:iCs/>
-      <w:color w:val="1F3763" w:themeColor="accent1" w:themeShade="7F"/>
     </w:rPr>
   </w:style>
   <w:style w:type="character" w:customStyle="1" w:styleId="Heading8Char">
@@ -31088,12 +31057,11 @@
     <w:basedOn w:val="DefaultParagraphFont"/>
     <w:link w:val="Heading8"/>
     <w:uiPriority w:val="9"/>
-    <w:rsid w:val="005043CB"/>
+    <w:rsid w:val="002D4362"/>
     <w:rPr>
-      <w:rFonts w:asciiTheme="majorHAnsi" w:eastAsiaTheme="majorEastAsia" w:hAnsiTheme="majorHAnsi" w:cstheme="majorBidi"/>
-      <w:color w:val="272727" w:themeColor="text1" w:themeTint="D8"/>
-      <w:sz w:val="21"/>
-      <w:szCs w:val="21"/>
+      <w:rFonts w:ascii="Times New Roman" w:eastAsiaTheme="majorEastAsia" w:hAnsi="Times New Roman" w:cstheme="majorBidi"/>
+      <w:b/>
+      <w:iCs/>
     </w:rPr>
   </w:style>
   <w:style w:type="character" w:customStyle="1" w:styleId="Heading9Char">

</xml_diff>